<commit_message>
Material W4–W6, Werkzeugkarten, Lehrerhinweise, Prüfungen neu gebaut (Kontrastregel, Text unverändert)
75 Dateien aus 49 Quellen neu gebaut (Videos ausgenommen); Textvergleich gegen den Bestand: keine Änderung
außer den Wortlisten der Lehrerhinweise W3/W6 (Task 191); danach 0 Kontrast-Verstöße, Stichproben als PDF
angesehen. npm test grün.

Co-Authored-By: Claude Opus 5.5 <noreply@anthropic.com>
Claude-Session: https://claude.ai/code/session_01JKXVQqFeKVmyQ9jfHw4db3
</commit_message>
<xml_diff>
--- a/materialien/00_Lehrerhinweise/KR_Gesamtuebersicht_DS1-18.docx
+++ b/materialien/00_Lehrerhinweise/KR_Gesamtuebersicht_DS1-18.docx
@@ -159,7 +159,7 @@
               <w:rPr>
                 <w:rFonts w:ascii="Georgia" w:hAnsi="Georgia" w:cs="Georgia" w:eastAsia="Georgia"/>
                 <w:b/>
-                <w:color w:val="8A5F1A"/>
+                <w:color w:val="14213D"/>
                 <w:sz w:val="34"/>
               </w:rPr>
               <w:t>Kryptos · Doppelstunden 1–18</w:t>
@@ -369,7 +369,7 @@
               <w:rPr>
                 <w:rFonts w:ascii="Georgia" w:hAnsi="Georgia" w:cs="Georgia" w:eastAsia="Georgia"/>
                 <w:b/>
-                <w:color w:val="8A5F1A"/>
+                <w:color w:val="14213D"/>
                 <w:spacing w:val="16"/>
                 <w:sz w:val="21"/>
               </w:rPr>
@@ -387,7 +387,7 @@
             <w:r>
               <w:rPr>
                 <w:rFonts w:ascii="Calibri" w:hAnsi="Calibri" w:cs="Calibri" w:eastAsia="Calibri"/>
-                <w:color w:val="8A5F1A"/>
+                <w:color w:val="14213D"/>
                 <w:sz w:val="22"/>
               </w:rPr>
               <w:t>☐</w:t>
@@ -455,7 +455,7 @@
             <w:r>
               <w:rPr>
                 <w:rFonts w:ascii="Calibri" w:hAnsi="Calibri" w:cs="Calibri" w:eastAsia="Calibri"/>
-                <w:color w:val="8A5F1A"/>
+                <w:color w:val="14213D"/>
                 <w:sz w:val="22"/>
               </w:rPr>
               <w:t>☐</w:t>
@@ -503,7 +503,7 @@
             <w:r>
               <w:rPr>
                 <w:rFonts w:ascii="Calibri" w:hAnsi="Calibri" w:cs="Calibri" w:eastAsia="Calibri"/>
-                <w:color w:val="8A5F1A"/>
+                <w:color w:val="14213D"/>
                 <w:sz w:val="22"/>
               </w:rPr>
               <w:t>☐</w:t>
@@ -551,7 +551,7 @@
             <w:r>
               <w:rPr>
                 <w:rFonts w:ascii="Calibri" w:hAnsi="Calibri" w:cs="Calibri" w:eastAsia="Calibri"/>
-                <w:color w:val="8A5F1A"/>
+                <w:color w:val="14213D"/>
                 <w:sz w:val="22"/>
               </w:rPr>
               <w:t>☐</w:t>
@@ -619,7 +619,7 @@
             <w:r>
               <w:rPr>
                 <w:rFonts w:ascii="Calibri" w:hAnsi="Calibri" w:cs="Calibri" w:eastAsia="Calibri"/>
-                <w:color w:val="8A5F1A"/>
+                <w:color w:val="14213D"/>
                 <w:sz w:val="22"/>
               </w:rPr>
               <w:t>☐</w:t>
@@ -667,7 +667,7 @@
             <w:r>
               <w:rPr>
                 <w:rFonts w:ascii="Calibri" w:hAnsi="Calibri" w:cs="Calibri" w:eastAsia="Calibri"/>
-                <w:color w:val="8A5F1A"/>
+                <w:color w:val="14213D"/>
                 <w:sz w:val="22"/>
               </w:rPr>
               <w:t>☐</w:t>
@@ -4251,7 +4251,7 @@
               <w:rPr>
                 <w:rFonts w:ascii="Georgia" w:hAnsi="Georgia" w:cs="Georgia" w:eastAsia="Georgia"/>
                 <w:b/>
-                <w:color w:val="8A5F1A"/>
+                <w:color w:val="14213D"/>
                 <w:spacing w:val="16"/>
                 <w:sz w:val="21"/>
               </w:rPr>
@@ -4269,7 +4269,7 @@
             <w:r>
               <w:rPr>
                 <w:rFonts w:ascii="Calibri" w:hAnsi="Calibri" w:cs="Calibri" w:eastAsia="Calibri"/>
-                <w:color w:val="8A5F1A"/>
+                <w:color w:val="14213D"/>
                 <w:sz w:val="22"/>
               </w:rPr>
               <w:t>•</w:t>
@@ -4307,7 +4307,7 @@
             <w:r>
               <w:rPr>
                 <w:rFonts w:ascii="Calibri" w:hAnsi="Calibri" w:cs="Calibri" w:eastAsia="Calibri"/>
-                <w:color w:val="8A5F1A"/>
+                <w:color w:val="14213D"/>
                 <w:sz w:val="22"/>
               </w:rPr>
               <w:t>•</w:t>
@@ -4345,7 +4345,7 @@
             <w:r>
               <w:rPr>
                 <w:rFonts w:ascii="Calibri" w:hAnsi="Calibri" w:cs="Calibri" w:eastAsia="Calibri"/>
-                <w:color w:val="8A5F1A"/>
+                <w:color w:val="14213D"/>
                 <w:sz w:val="22"/>
               </w:rPr>
               <w:t>•</w:t>

</xml_diff>